<commit_message>
OBA theme memo v5: align category A with its example list; clarify cut names cited as evidence
</commit_message>
<xml_diff>
--- a/themes/outcome-based-agents/insights/exports/OBA-theme-memo-v5-2026-10-29.docx
+++ b/themes/outcome-based-agents/insights/exports/OBA-theme-memo-v5-2026-10-29.docx
@@ -454,63 +454,83 @@
       </w:pPr>
       <w:r>
         <w:rPr/>
-        <w:t xml:space="preserve">Agent Infrastructure</w:t>
-      </w:r>
-    </w:p>
-    <w:p>
-      <w:pPr>
-        <w:pStyle w:val="ListParagraph"/>
-        <w:numPr>
-          <w:ilvl w:val="0"/>
-          <w:numId w:val="3"/>
-        </w:numPr>
-        <w:spacing w:after="60"/>
-      </w:pPr>
-      <w:r>
-        <w:rPr>
-          <w:b/>
-        </w:rPr>
-        <w:t xml:space="preserve">Tailwinds: Every company that runs agents needs testing, monitoring, permissions and compute around the model, and that spending grows with each agent in production. </w:t>
-      </w:r>
-      <w:r>
-        <w:rPr/>
-        <w:t xml:space="preserve">In a LangChain survey of agent builders, 57% said they already had agents in production (LangChain).</w:t>
-      </w:r>
-    </w:p>
-    <w:p>
-      <w:pPr>
-        <w:pStyle w:val="ListParagraph"/>
-        <w:numPr>
-          <w:ilvl w:val="0"/>
-          <w:numId w:val="3"/>
-        </w:numPr>
-        <w:spacing w:after="60"/>
-      </w:pPr>
-      <w:r>
-        <w:rPr>
-          <w:b/>
-        </w:rPr>
-        <w:t xml:space="preserve">Model usage is now a major cost line for agent companies, which creates demand for tools that send each step to the cheapest capable model. </w:t>
-      </w:r>
-      <w:r>
-        <w:rPr/>
-        <w:t xml:space="preserve">LangChain's own router cut median model cost per thread from $2.61 to $0.94 across 973 agent threads with no measurable loss in output (The New Stack).</w:t>
-      </w:r>
-    </w:p>
-    <w:p>
-      <w:pPr>
-        <w:pStyle w:val="ListParagraph"/>
-        <w:numPr>
-          <w:ilvl w:val="0"/>
-          <w:numId w:val="3"/>
-        </w:numPr>
-        <w:spacing w:after="60"/>
-      </w:pPr>
-      <w:r>
-        <w:rPr>
-          <w:b/>
-        </w:rPr>
-        <w:t xml:space="preserve">Security failures are making agent identity and permissions a required purchase for security teams. </w:t>
+        <w:t xml:space="preserve">Agent Platforms, Frameworks and Infrastructure</w:t>
+      </w:r>
+    </w:p>
+    <w:p>
+      <w:pPr>
+        <w:pStyle w:val="ListParagraph"/>
+        <w:numPr>
+          <w:ilvl w:val="0"/>
+          <w:numId w:val="3"/>
+        </w:numPr>
+        <w:spacing w:after="60"/>
+      </w:pPr>
+      <w:r>
+        <w:rPr>
+          <w:b/>
+        </w:rPr>
+        <w:t xml:space="preserve">Tailwinds: Agents are moving into production at most companies that build them, and the labs and clouds supply the models, platforms and runtimes those agents run on. </w:t>
+      </w:r>
+      <w:r>
+        <w:rPr/>
+        <w:t xml:space="preserve">In a LangChain survey of agent builders, 57% said they already had agents in production (LangChain), and Microsoft says Agent 365 registered nearly 40 million agents across tens of thousands of companies two months after launch (Microsoft earnings call).</w:t>
+      </w:r>
+    </w:p>
+    <w:p>
+      <w:pPr>
+        <w:pStyle w:val="ListParagraph"/>
+        <w:numPr>
+          <w:ilvl w:val="0"/>
+          <w:numId w:val="3"/>
+        </w:numPr>
+        <w:spacing w:after="60"/>
+      </w:pPr>
+      <w:r>
+        <w:rPr>
+          <w:b/>
+        </w:rPr>
+        <w:t xml:space="preserve">Each lab and cloud now sells a full platform to build, run and govern agents, so enterprise agent spending flows through them. </w:t>
+      </w:r>
+      <w:r>
+        <w:rPr/>
+        <w:t xml:space="preserve">OpenAI launched Frontier to build, deploy and manage agents, with HP, Intuit and Uber among its first named adopters (OpenAI), and AWS added a managed agent loop and agent payments to AgentCore in 2026 (AWS).</w:t>
+      </w:r>
+    </w:p>
+    <w:p>
+      <w:pPr>
+        <w:pStyle w:val="ListParagraph"/>
+        <w:numPr>
+          <w:ilvl w:val="0"/>
+          <w:numId w:val="3"/>
+        </w:numPr>
+        <w:spacing w:after="60"/>
+      </w:pPr>
+      <w:r>
+        <w:rPr>
+          <w:b/>
+        </w:rPr>
+        <w:t xml:space="preserve">Agent frameworks have become a standard way for developers to build agents, and the clouds now plug them into their own deployment tools. </w:t>
+      </w:r>
+      <w:r>
+        <w:rPr/>
+        <w:t xml:space="preserve">Google's Agents CLI ships a LangChain extension so that LangChain and LangGraph agents use Google's tools to deploy, test and monitor them (Google for Developers).</w:t>
+      </w:r>
+    </w:p>
+    <w:p>
+      <w:pPr>
+        <w:pStyle w:val="ListParagraph"/>
+        <w:numPr>
+          <w:ilvl w:val="0"/>
+          <w:numId w:val="3"/>
+        </w:numPr>
+        <w:spacing w:after="60"/>
+      </w:pPr>
+      <w:r>
+        <w:rPr>
+          <w:b/>
+        </w:rPr>
+        <w:t xml:space="preserve">Every agent in production also needs testing, monitoring, permissions and billing, which adds spending around each agent a company runs. </w:t>
       </w:r>
       <w:r>
         <w:rPr/>
@@ -590,11 +610,11 @@
         <w:rPr>
           <w:b/>
         </w:rPr>
-        <w:t xml:space="preserve">Why we should not focus here: Agent infrastructure is sold to engineering teams on usage, and the labs that sell the model bundle the same tools for free. </w:t>
-      </w:r>
-      <w:r>
-        <w:rPr/>
-        <w:t xml:space="preserve">Companies here compete with their own suppliers, earn usage revenue that falls with model prices and tend to sell to a lab or cloud provider at a modest price, so the returns go to the model owners and to the applications that sell the finished job.</w:t>
+        <w:t xml:space="preserve">Why we should not focus here: The labs and hyperscalers own the models and agent platforms that every other category runs on, and they are not companies a venture fund can back. </w:t>
+      </w:r>
+      <w:r>
+        <w:rPr/>
+        <w:t xml:space="preserve">Independent frameworks and infrastructure sell to engineering teams on usage while the labs bundle the same tools free, so these companies compete with their suppliers and tend to sell to a lab or cloud at a modest price.</w:t>
       </w:r>
     </w:p>
     <w:p>
@@ -876,11 +896,11 @@
         <w:rPr>
           <w:b/>
         </w:rPr>
-        <w:t xml:space="preserve">The leading horizontal companies report fast growth from enterprise customers, although the figures are their own. </w:t>
-      </w:r>
-      <w:r>
-        <w:rPr/>
-        <w:t xml:space="preserve">Ema reports bookings over $150M (Ema, claim), and Skan AI reports revenue growth over 300% with existing customers spending about 50% more each year (Skan AI, claim).</w:t>
+        <w:t xml:space="preserve">Companies selling into this layer report fast growth from enterprise customers, although the figures are their own. </w:t>
+      </w:r>
+      <w:r>
+        <w:rPr/>
+        <w:t xml:space="preserve">Ema reports bookings over $150M (Ema, claim), and Skan AI, which records how work gets done and feeds that record to agents, reports revenue growth over 300% with existing customers spending about 50% more each year (Skan AI, claim).</w:t>
       </w:r>
     </w:p>
     <w:p>
@@ -1346,7 +1366,7 @@
       </w:r>
       <w:r>
         <w:rPr/>
-        <w:t xml:space="preserve">A former 11x advisor puts churn at 80% to 90%, the worst of any category he advises (expert call), and a former Apollo product manager says Claude is now Clay's biggest competitor for small teams (expert call).</w:t>
+        <w:t xml:space="preserve">A former 11x advisor puts churn at 80% to 90%, the worst of any category he advises (expert call), and a former Apollo product manager says Claude is now the biggest competitor for small teams to Clay, a sales data and workflow tool (expert call).</w:t>
       </w:r>
     </w:p>
     <w:p>
@@ -1510,7 +1530,7 @@
       </w:r>
       <w:r>
         <w:rPr/>
-        <w:t xml:space="preserve">Bessemer argues that AI-native ERPs such as Rillet put the old systems of record under pressure (Bessemer), and Rillet's revenue doubled in 12 weeks (Crunchbase News).</w:t>
+        <w:t xml:space="preserve">Bessemer argues that AI-native ledgers such as Rillet, which sell the accounting system itself rather than an agent, put the old systems of record under pressure (Bessemer), and Rillet's revenue doubled in 12 weeks (Crunchbase News).</w:t>
       </w:r>
     </w:p>
     <w:p>
@@ -1714,7 +1734,7 @@
       </w:r>
       <w:r>
         <w:rPr/>
-        <w:t xml:space="preserve">EvenUp prices per demand package, the file of evidence and damages a personal injury lawyer sends an insurer to settle a claim (Bessemer), and says it handles 10,000 cases a week (EvenUp, claim), and Eudia's lead investor frames its market as legal services spending (Eudia).</w:t>
+        <w:t xml:space="preserve">EvenUp prices per demand package, the file of evidence and damages a personal injury lawyer sends an insurer to settle a claim (Bessemer), and says it handles 10,000 cases a week (EvenUp, claim), and the lead investor in Eudia, a legal AI company that augments in-house lawyers, frames its market as legal services spending (Eudia).</w:t>
       </w:r>
     </w:p>
     <w:p>

</xml_diff>